<commit_message>
Refine writeup prose (domain, price model methodology) and sync no-graphs docx with graphs version
Co-Authored-By: Claude Sonnet 5 <noreply@anthropic.com>
</commit_message>
<xml_diff>
--- a/docs/writeup.docx
+++ b/docs/writeup.docx
@@ -125,7 +125,23 @@
           <w:i w:val="0"/>
           <w:rtl/>
         </w:rPr>
-        <w:t>פלטפורמות השכרה קצרת־טווח, כגון Airbnb, מציעות אלפי נכסים המתחרים על חשיפת המשתמשים, בעוד שבפועל רק חלק קטן מהם זוכה לבולטות גבוהה בתוצאות החיפוש. כתוצאה מכך, נכסים איכותיים עשויים להישאר פחות מוכרים. בפרויקט זה התמקדנו בשוק ה־Airbnb ברומא, איטליה, והגדרנו נכס כ־</w:t>
+        <w:t>פלטפורמות להשכרה קצרת־טווח, כגון Airbnb, מציעות מגוון רחב של נכסים הנבדלים זה מזה במחיר, במיקום, בדירוגים ובמאפיינים נוספים. עבור המשתמש, ההיצע הרחב מקשה לעיתים לזהות אילו נכסים באמת מציעים תמורה טובה, ולכן הבחירה יכולה להרגיש כמו "miss or hit".</w:t>
+      </w:r>
+    </w:p>
+    <w:p>
+      <w:pPr>
+        <w:bidi/>
+        <w:spacing w:after="120"/>
+        <w:jc w:val="left"/>
+      </w:pPr>
+      <w:r>
+        <w:rPr>
+          <w:rFonts w:ascii="Segoe UI" w:hAnsi="Segoe UI" w:cs="Segoe UI"/>
+          <w:b w:val="0"/>
+          <w:i w:val="0"/>
+          <w:rtl/>
+        </w:rPr>
+        <w:t xml:space="preserve">בפרויקט זה התמקדנו בשוק ה־Airbnb ברומא, איטליה, וביקשנו לזהות נכסים מסוג </w:t>
       </w:r>
       <w:r>
         <w:rPr>
@@ -135,7 +151,7 @@
           <w:color w:val="0B3D4D"/>
           <w:rtl/>
         </w:rPr>
-        <w:t>"Hidden Gem"</w:t>
+        <w:t>"Hidden Gems"</w:t>
       </w:r>
       <w:r>
         <w:rPr>
@@ -144,7 +160,40 @@
           <w:i w:val="0"/>
           <w:rtl/>
         </w:rPr>
-        <w:t xml:space="preserve"> כאשר הוא עומד בשלושה תנאים מרכזיים: הוא מתומחר באופן אטרקטיבי ביחס לנכסים דומים, זוכה לביקורות חיוביות, ובו בזמן אינו מוכר במיוחד. מטרתנו הייתה לבחון האם ניתן לזהות נכסים כאלה באופן אוטומטי באמצעות נתוני נכסים וביקורות ציבוריים, להבין אילו מאפיינים מייחדים אותם משאר השוק, ולבדוק האם הם מתחלקים לתת־קבוצות בעלות מאפיינים משותפים.</w:t>
+        <w:t>. לצורך הגדרת המושג הסתמכנו על הגדרת Wiktionary¹, המתארת Hidden Gem כדבר בעל ערך או איכות שאינו זוכה להכרה התואמת את ערכו. מתוך הגדרה זו גזרנו שלושה קריטריונים מדידים המתאימים לעולם ה־Airbnb: מחיר אטרקטיבי ביחס לנכסים דומים, ביקורות חיוביות ורמת פופולריות נמוכה יחסית. כלומר, חיפשנו נכסים המציעים תמורה ואיכות גבוהות, אך עדיין זוכים לפחות הכרה מנכסים דומים בשוק.</w:t>
+      </w:r>
+    </w:p>
+    <w:p>
+      <w:pPr>
+        <w:bidi/>
+        <w:spacing w:after="120"/>
+        <w:jc w:val="left"/>
+      </w:pPr>
+      <w:r>
+        <w:rPr>
+          <w:rFonts w:ascii="Segoe UI" w:hAnsi="Segoe UI" w:cs="Segoe UI"/>
+          <w:b w:val="0"/>
+          <w:i w:val="0"/>
+          <w:rtl/>
+        </w:rPr>
+        <w:t>מטרת הפרויקט הייתה לבחון האם ניתן לזהות נכסים כאלה באופן אוטומטי באמצעות נתוני נכסים וביקורות ציבוריות, להבין אילו מאפיינים מייחדים אותם משאר השוק, ולבדוק האם ניתן לזהות בתוכם תת־קבוצות בעלות מאפיינים משותפים.</w:t>
+      </w:r>
+    </w:p>
+    <w:p>
+      <w:pPr>
+        <w:bidi/>
+        <w:spacing w:after="120"/>
+        <w:jc w:val="left"/>
+      </w:pPr>
+      <w:r>
+        <w:rPr>
+          <w:rFonts w:ascii="Segoe UI" w:hAnsi="Segoe UI" w:cs="Segoe UI"/>
+          <w:b w:val="0"/>
+          <w:i/>
+          <w:color w:val="555555"/>
+          <w:rtl/>
+        </w:rPr>
+        <w:t>¹ Wiktionary. (2026). Hidden gem. In Wiktionary, the free dictionary. Retrieved July 29, 2026, from https://en.wiktionary.org/wiki/hidden_gem</w:t>
       </w:r>
     </w:p>
     <w:p>
@@ -611,7 +660,7 @@
           <w:i w:val="0"/>
           <w:rtl/>
         </w:rPr>
-        <w:t xml:space="preserve">בשל מספרן הרב של הביקורות ובמטרה להימנע מהטיות ושגיאות הנובעות מתרגום אוטומטי, בחרנו להתמקד בביקורות שנכתבו באנגלית בלבד. במהלך הפרויקט התברר כי שיטת סינון השפה הראשונית לא הייתה מדויקת מספיק, וכי חלק מהביקורות שסווגו כאנגליות נכתבו למעשה בשפות אחרות (כ-42% מהן, לפי בדיקה מדגמית). לכן, לצורך ניתוח הטקסט, ביצענו סינון מדויק יותר באמצעות הספרייה </w:t>
+        <w:t xml:space="preserve">מאחר שמאגר הביקורות כולל טקסטים בשפות רבות, ובמטרה להימנע מהטיות ושגיאות הנובעות מתרגום אוטומטי, בחרנו לבצע את הניתוח הטקסטואלי על ביקורות באנגלית בלבד (מזוהות באמצעות </w:t>
       </w:r>
       <w:r>
         <w:rPr>
@@ -629,7 +678,7 @@
           <w:i w:val="0"/>
           <w:rtl/>
         </w:rPr>
-        <w:t xml:space="preserve"> והשארנו רק ביקורות שזוהו כאנגלית.</w:t>
+        <w:t>), שהיוו כ-56% מהביקורות הרלוונטיות.</w:t>
       </w:r>
     </w:p>
     <w:p>
@@ -824,25 +873,7 @@
           <w:i w:val="0"/>
           <w:rtl/>
         </w:rPr>
-        <w:t xml:space="preserve"> לצורך חיזוי המחיר אימנו מודל עץ החלטה מסוג </w:t>
-      </w:r>
-      <w:r>
-        <w:rPr>
-          <w:rFonts w:ascii="Segoe UI" w:hAnsi="Segoe UI" w:cs="Segoe UI"/>
-          <w:b w:val="0"/>
-          <w:i w:val="0"/>
-          <w:rtl/>
-        </w:rPr>
-        <w:t>DecisionTreeRegressor</w:t>
-      </w:r>
-      <w:r>
-        <w:rPr>
-          <w:rFonts w:ascii="Segoe UI" w:hAnsi="Segoe UI" w:cs="Segoe UI"/>
-          <w:b w:val="0"/>
-          <w:i w:val="0"/>
-          <w:rtl/>
-        </w:rPr>
-        <w:t>. משתנה המטרה היה הלוגריתם של מחיר הנכס, שנבחר כדי לצמצם את השפעתם של מחירים חריגים ולמתן את ההתפלגות הימנית של המחירים. מורכבות העץ הוגבלה (</w:t>
+        <w:t xml:space="preserve"> לצורך חיזוי המחיר השתמשנו במודל עץ החלטה. מכיוון שהתפלגות המחירים הייתה מוטה וכללה גם מחירים חריגים, המודל נבנה לחיזוי הלוגריתם של מחיר הנכס ולא המחיר עצמו. כך צמצמנו את השפעתם של ערכים קיצוניים על החיזוי. כדי למנוע מהעץ להפוך למורכב מדי, הגבלנו את עומקו ואת מספר הדגימות המינימלי בכל עלה (</w:t>
       </w:r>
       <w:r>
         <w:rPr>
@@ -878,7 +909,7 @@
           <w:i w:val="0"/>
           <w:rtl/>
         </w:rPr>
-        <w:t>), כאשר הפרמטרים נבחרו באמצעות cross-validation על קבוצת האימון בלבד.</w:t>
+        <w:t>). ערכים אלה נבחרו באמצעות cross-validation על קבוצת האימון בלבד.</w:t>
       </w:r>
     </w:p>
     <w:p>
@@ -894,7 +925,7 @@
           <w:i w:val="0"/>
           <w:rtl/>
         </w:rPr>
-        <w:t>המודל התבסס על מאפיינים מבניים של הנכס, ובהם מספר האורחים שהוא מארח, מספר חדרי השינה והרחצה, מספר השירותים שהוא מציע, קווי הרוחב והאורך, מספר הלילות המינימלי והמקסימלי להזמנה, ותק המארח ומספר הנכסים שברשותו. בנוסף, כללנו את סוג החדר, סוג הנכס ואת אזור הנכס באמצעות קידוד קטגוריאלי — בסך הכול 53 משתנים.</w:t>
+        <w:t>המודל התבסס על מאפיינים מבניים ותפעוליים של הנכס, ובהם מספר האורחים שהנכס יכול לארח, מספר חדרי השינה והרחצה, מספר השירותים המוצעים, קווי הרוחב והאורך, מספר הלילות המינימלי והמקסימלי להזמנה, ותק המארח ומספר הנכסים שברשותו. בנוסף, כללנו את סוג החדר, סוג הנכס ואזור הנכס, שהומרו ממשתנים קטגוריאליים למשתנים מספריים. בסך הכול כלל המודל 53 משתנים.</w:t>
       </w:r>
     </w:p>
     <w:p>
@@ -910,7 +941,7 @@
           <w:i w:val="0"/>
           <w:rtl/>
         </w:rPr>
-        <w:t xml:space="preserve">במכוון לא נכללו מאפיינים המעידים על פופולריות: מספר הביקורות, קצב קבלת הביקורות, דירוגי הביקורות, הזמינות והתפוסה המוערכת. הסיבה היא שהפער בין המחיר בפועל למחיר החזוי משמש בהמשך כאחד הקריטריונים לזיהוי Hidden Gem, ולכן מודל שכבר מכיר את מידת הפופולריות של הנכס היה מזהם קריטריון זה. מאותה סיבה הוצא גם </w:t>
+        <w:t xml:space="preserve">במכוון לא נכללו במודל מאפיינים שעשויים לשקף את מידת הפופולריות או הביקוש לנכס, ובהם מספר הביקורות, קצב קבלת הביקורות, דירוגי הביקורות, הזמינות והתפוסה המוערכת. הסיבה לכך היא שהפער בין המחיר בפועל למחיר החזוי שימש בהמשך כקריטריון נפרד בזיהוי Hidden Gems, ולכן רצינו שמודל חיזוי המחיר יתבסס ככל האפשר על מאפייני הנכס עצמו ולא על מידת ההצלחה או הביקוש שלו בפועל. מאותה סיבה הוסר גם המשתנה </w:t>
       </w:r>
       <w:r>
         <w:rPr>
@@ -928,7 +959,7 @@
           <w:i w:val="0"/>
           <w:rtl/>
         </w:rPr>
-        <w:t>, המהווה למעשה מכפלה של המחיר במספר הלילות שהוזמנו.</w:t>
+        <w:t>, המחושב על בסיס מחיר הנכס ומספר הלילות שהוזמנו.</w:t>
       </w:r>
     </w:p>
     <w:p>
@@ -944,45 +975,7 @@
           <w:i w:val="0"/>
           <w:rtl/>
         </w:rPr>
-        <w:t xml:space="preserve">הנתונים חולקו לקבוצת אימון שכללה </w:t>
-      </w:r>
-      <w:r>
-        <w:rPr>
-          <w:rFonts w:ascii="Segoe UI" w:hAnsi="Segoe UI" w:cs="Segoe UI"/>
-          <w:b/>
-          <w:i w:val="0"/>
-          <w:color w:val="0B3D4D"/>
-          <w:rtl/>
-        </w:rPr>
-        <w:t>20%</w:t>
-      </w:r>
-      <w:r>
-        <w:rPr>
-          <w:rFonts w:ascii="Segoe UI" w:hAnsi="Segoe UI" w:cs="Segoe UI"/>
-          <w:b w:val="0"/>
-          <w:i w:val="0"/>
-          <w:rtl/>
-        </w:rPr>
-        <w:t xml:space="preserve"> מהנכסים ולקבוצת בדיקה שכללה </w:t>
-      </w:r>
-      <w:r>
-        <w:rPr>
-          <w:rFonts w:ascii="Segoe UI" w:hAnsi="Segoe UI" w:cs="Segoe UI"/>
-          <w:b/>
-          <w:i w:val="0"/>
-          <w:color w:val="0B3D4D"/>
-          <w:rtl/>
-        </w:rPr>
-        <w:t>80%</w:t>
-      </w:r>
-      <w:r>
-        <w:rPr>
-          <w:rFonts w:ascii="Segoe UI" w:hAnsi="Segoe UI" w:cs="Segoe UI"/>
-          <w:b w:val="0"/>
-          <w:i w:val="0"/>
-          <w:rtl/>
-        </w:rPr>
-        <w:t xml:space="preserve"> — יחס הפוך מהמקובל. הבחירה נובעת מכך שבבעיה 2 נכס יכול להיחשב Hidden Gem רק אם המחיר החזוי לו הוא הערכה אמיתית שלא נלמדה מהנכס עצמו (out-of-sample) — כלומר רק אם הוא נמצא בקבוצת הבדיקה. הגדלת קבוצת הבדיקה ל-80% מבטיחה שלמספר הרב ביותר האפשרי של נכסים תהיה תחזית מחיר תקפה לבדיקה זו. לאחר אימון המודל חישבנו עבור כל נכס את המחיר החזוי, ואת הפער בין המחיר בפועל למחיר החזוי. פער שלילי הצביע על נכס שמחירו נמוך מהמחיר שהמודל צפה עבורו.</w:t>
+        <w:t>לאחר אימון המודל חישבנו עבור כל נכס את המחיר החזוי ואת הפער בינו לבין המחיר בפועל. פער שלילי העיד כי מחירו בפועל של הנכס נמוך מהמחיר שהמודל צפה עבור נכס בעל מאפיינים דומים, ולכן שימש אינדיקציה לתמחור אטרקטיבי יחסית.</w:t>
       </w:r>
     </w:p>
     <w:p>
@@ -1016,23 +1009,7 @@
           <w:i w:val="0"/>
           <w:rtl/>
         </w:rPr>
-        <w:t xml:space="preserve"> את ביצועי המודל הערכנו על קבוצת הבדיקה בלבד, כדי לבחון את יכולתו לחזות מחירים של נכסים שלא נכללו באימון. השתמשנו במדדי RMSE ו־MAPE, המודדים בהתאמה את גודל טעות החיזוי ואת שיעור הסטייה היחסי בין המחיר בפועל למחיר החזוי.</w:t>
-      </w:r>
-    </w:p>
-    <w:p>
-      <w:pPr>
-        <w:bidi/>
-        <w:spacing w:after="120"/>
-        <w:jc w:val="left"/>
-      </w:pPr>
-      <w:r>
-        <w:rPr>
-          <w:rFonts w:ascii="Segoe UI" w:hAnsi="Segoe UI" w:cs="Segoe UI"/>
-          <w:b w:val="0"/>
-          <w:i w:val="0"/>
-          <w:rtl/>
-        </w:rPr>
-        <w:t>בנוסף, השווינו בין הביצועים על קבוצת הבדיקה לבין הביצועים על כלל הנתונים. השוואה זו נועדה לבדוק האם המודל התאים את עצמו יתר על המידה לנתוני האימון.</w:t>
+        <w:t xml:space="preserve"> את ביצועי המודל הערכנו באמצעות מדדי RMSE ו־MAPE, המודדים בהתאמה את גודל טעות החיזוי ואת שיעור הסטייה היחסי בין המחיר בפועל למחיר החזוי. הביצועים הסופיים נמדדו על קבוצת הבדיקה, כדי לבחון את יכולת המודל לחזות מחירים של נכסים שלא נכללו באימון. בנוסף, השווינו בין ביצועי המודל על קבוצת האימון לבין ביצועיו על קבוצת הבדיקה, כדי לבדוק האם קיימים סימנים ל־overfitting.</w:t>
       </w:r>
     </w:p>
     <w:p>
@@ -1066,7 +1043,23 @@
           <w:i w:val="0"/>
           <w:rtl/>
         </w:rPr>
-        <w:t xml:space="preserve"> לצורך הערכת ביצועי המודל השתמשנו בקבוצת הבדיקה, שכללה 80% מהנכסים (18,355) ולא שימשה בתהליך האימון. טעויות החיזוי חושבו הן בסולם הלוגריתמי שבו אומן המודל, והן לאחר המרת התחזיות חזרה למחירים ביורו, כדי לאפשר פרשנות מעשית של התוצאות.</w:t>
+        <w:t xml:space="preserve"> הנתונים חולקו באופן אקראי לשתי קבוצות: 20% מהנכסים שימשו כקבוצת האימון, ו־80% הנותרים, 18,355 נכסים, שימשו כקבוצת הבדיקה. קבוצת האימון שימשה לאימון המודל ולבחירת הפרמטרים באמצעות cross-validation, בעוד שקבוצת הבדיקה נשמרה להערכת הביצועים הסופית ולחיזוי מחירים עבור נכסים שלא נכללו בתהליך האימון.</w:t>
+      </w:r>
+    </w:p>
+    <w:p>
+      <w:pPr>
+        <w:bidi/>
+        <w:spacing w:after="120"/>
+        <w:jc w:val="left"/>
+      </w:pPr>
+      <w:r>
+        <w:rPr>
+          <w:rFonts w:ascii="Segoe UI" w:hAnsi="Segoe UI" w:cs="Segoe UI"/>
+          <w:b w:val="0"/>
+          <w:i w:val="0"/>
+          <w:rtl/>
+        </w:rPr>
+        <w:t>מכיוון שהמודל אומן על הלוגריתם של המחיר, טעויות החיזוי חושבו הן בסולם הלוגריתמי והן לאחר המרת התחזיות חזרה למחירים ביורו, כדי לאפשר פרשנות מעשית של התוצאות.</w:t>
       </w:r>
     </w:p>
     <w:p>
@@ -1477,26 +1470,7 @@
           <w:i w:val="0"/>
           <w:rtl/>
         </w:rPr>
-        <w:t xml:space="preserve">פער ההכללה (test↔כל הדאטה) ב-RMSE(log price) הוא </w:t>
-      </w:r>
-      <w:r>
-        <w:rPr>
-          <w:rFonts w:ascii="Segoe UI" w:hAnsi="Segoe UI" w:cs="Segoe UI"/>
-          <w:b/>
-          <w:i w:val="0"/>
-          <w:color w:val="0B3D4D"/>
-          <w:rtl/>
-        </w:rPr>
-        <w:t>+0.0068</w:t>
-      </w:r>
-      <w:r>
-        <w:rPr>
-          <w:rFonts w:ascii="Segoe UI" w:hAnsi="Segoe UI" w:cs="Segoe UI"/>
-          <w:b w:val="0"/>
-          <w:i w:val="0"/>
-          <w:rtl/>
-        </w:rPr>
-        <w:t xml:space="preserve"> — קטן מאוד, סימן לכך שהמודל כמעט לא "נהנה" משורות שראה באימון.</w:t>
+        <w:t>בפועל, טעות של כ-30% מהמחיר (MAPE) מספיקה כדי לספק בסיס אמין להשוואה בין המחיר בפועל למחיר הצפוי, וזהו הבסיס לזיהוי הנכסים המתומחרים בחסר בבעיה 2. ההבדל ב־RMSE בין קבוצת הבדיקה לבין כלל הנתונים היה קטן מאוד (0.0068), כלומר ביצועי המודל על נכסים שלא נכללו באימון היו דומים מאוד לביצועיו על כלל הנתונים.</w:t>
       </w:r>
     </w:p>
     <w:p>
@@ -1530,7 +1504,7 @@
           <w:i w:val="0"/>
           <w:rtl/>
         </w:rPr>
-        <w:t xml:space="preserve"> מחיר בפועל מול מחיר חזוי (סקאלת log-log) על ה-test set (n=18,355), כאשר כל 453 ה-Hidden Gems הסופיים מודגשים — מטבע ההגדרה (ראו בעיה 2), כולם נמצאים בקבוצת הבדיקה.</w:t>
+        <w:t xml:space="preserve"> מחיר בפועל מול מחיר חזוי (סקאלת log-log) על ה-test set (n=18,355), כאשר כל 453 ה-Hidden Gems הסופיים מודגשים.</w:t>
       </w:r>
     </w:p>
     <w:p>
@@ -1613,6 +1587,38 @@
         <w:spacing w:after="120"/>
         <w:jc w:val="left"/>
       </w:pPr>
+    </w:p>
+    <w:p>
+      <w:pPr>
+        <w:bidi/>
+        <w:spacing w:after="20"/>
+        <w:jc w:val="left"/>
+      </w:pPr>
+      <w:r>
+        <w:rPr>
+          <w:rFonts w:ascii="Segoe UI" w:hAnsi="Segoe UI" w:cs="Segoe UI"/>
+          <w:b/>
+          <w:i w:val="0"/>
+          <w:color w:val="0072B2"/>
+          <w:sz w:val="22"/>
+          <w:rtl/>
+        </w:rPr>
+        <w:t>השוואה בין עץ בסיס לעץ המוגבל</w:t>
+      </w:r>
+    </w:p>
+    <w:p>
+      <w:pPr>
+        <w:bidi/>
+        <w:spacing w:after="120"/>
+        <w:jc w:val="left"/>
+      </w:pPr>
+    </w:p>
+    <w:p>
+      <w:pPr>
+        <w:bidi/>
+        <w:spacing w:after="120"/>
+        <w:jc w:val="left"/>
+      </w:pPr>
       <w:r>
         <w:rPr>
           <w:rFonts w:ascii="Segoe UI" w:hAnsi="Segoe UI" w:cs="Segoe UI"/>
@@ -1620,7 +1626,23 @@
           <w:i w:val="0"/>
           <w:rtl/>
         </w:rPr>
-        <w:t xml:space="preserve"> עץ החלטה ללא הגבלת מורכבות על קבוצת האימון (4,588 נכסים) סובל מהתאמת יתר משמעותית: הוא מייצר 4,440 עלים — כלומר עלה נפרד כמעט לכל נכס — וטעות האימון שלו יורדת ל־0.004 בעוד שטעות הבדיקה נשארת 0.555. לכן מורכבות העץ מוגבלת, והפרמטרים (</w:t>
+        <w:t>כדי לבחון האם יש צורך להגביל את מורכבות עץ ההחלטה, השווינו תחילה בין עץ ללא הגבלת מורכבות לבין העץ המוגבל ששימש במודל הסופי. העץ הלא־מוגבל, שאומן על 4,588 נכסים, יצר 4,440 עלים - כמעט עלה נפרד לכל נכס. כתוצאה מכך, טעות האימון שלו הייתה נמוכה מאוד (0.004), אך טעות הבדיקה נותרה גבוהה (0.555), דבר המעיד על overfitting משמעותי.</w:t>
+      </w:r>
+    </w:p>
+    <w:p>
+      <w:pPr>
+        <w:bidi/>
+        <w:spacing w:after="120"/>
+        <w:jc w:val="left"/>
+      </w:pPr>
+      <w:r>
+        <w:rPr>
+          <w:rFonts w:ascii="Segoe UI" w:hAnsi="Segoe UI" w:cs="Segoe UI"/>
+          <w:b w:val="0"/>
+          <w:i w:val="0"/>
+          <w:rtl/>
+        </w:rPr>
+        <w:t xml:space="preserve">בעקבות זאת הגבלנו את מורכבות העץ, כאשר הערכים </w:t>
       </w:r>
       <w:r>
         <w:rPr>
@@ -1638,7 +1660,7 @@
           <w:i w:val="0"/>
           <w:rtl/>
         </w:rPr>
-        <w:t xml:space="preserve">, </w:t>
+        <w:t xml:space="preserve"> ו־</w:t>
       </w:r>
       <w:r>
         <w:rPr>
@@ -1656,7 +1678,7 @@
           <w:i w:val="0"/>
           <w:rtl/>
         </w:rPr>
-        <w:t>) נבחרים באמצעות 5-fold cross-validation על קבוצת האימון בלבד. העץ המוגבל מונה 91 עלים בלבד: הפער בין טעות האימון לטעות הבדיקה מצטמצם מ־0.551 ל־</w:t>
+        <w:t xml:space="preserve"> נבחרו באמצעות 5-fold cross-validation על קבוצת האימון בלבד. העץ המוגבל כלל 91 עלים בלבד. לאחר ההגבלה, הפער בין טעות האימון לטעות הבדיקה הצטמצם מ־0.551 ל־</w:t>
       </w:r>
       <w:r>
         <w:rPr>
@@ -1675,7 +1697,7 @@
           <w:i w:val="0"/>
           <w:rtl/>
         </w:rPr>
-        <w:t>, וטעות הבדיקה עצמה משתפרת מ־0.555 ל־</w:t>
+        <w:t>, ובמקביל טעות הבדיקה השתפרה מ־0.555 ל־</w:t>
       </w:r>
       <w:r>
         <w:rPr>
@@ -1710,7 +1732,7 @@
           <w:i w:val="0"/>
           <w:rtl/>
         </w:rPr>
-        <w:t>ממצא זה מדגיש את החשיבות של הערכת מודלים על נתונים שלא שימשו בתהליך האימון — הערכה על כלל הנתונים לא הייתה משקפת את איכות החיזוי האמיתית, משום שעץ לא-מוגבל לומד חלק גדול מנתוני האימון באופן כמעט מדויק. זו גם הסיבה לדרישה המפורשת בבעיה 2 שנכס Hidden Gem יהיה בקבוצת הבדיקה: כך הקריטריון של פער מחיר לעולם לא מתבסס על תחזית ש"שוחזרה" מזיכרון המודל, אלא על הערכה אמיתית.</w:t>
+        <w:t>השוואה זו הראתה כי הגבלת מורכבות העץ משפרת את יכולתו להכליל לנכסים שלא ראה במהלך האימון. מסיבה זו, זיהוי ה־Hidden Gems בוצע רק על נכסים מקבוצת הבדיקה, כך שפער המחיר שעליו מבוסס הקריטריון חושב תמיד עבור נכס שלא שימש לאימון המודל.</w:t>
       </w:r>
     </w:p>
     <w:p>
@@ -1765,7 +1787,7 @@
           <w:i w:val="0"/>
           <w:rtl/>
         </w:rPr>
-        <w:t xml:space="preserve"> מטרת שלב זה הייתה לזהות נכסים המהווים Hidden Gems – נכסים איכותיים שאינם זוכים לחשיפה רבה, אך מציעים תמורה גבוהה ביחס למחירם. הנחנו כי ניתן לזהות נכסים כאלה באמצעות שילוב של שלושה מאפיינים: פופולריות נמוכה יחסית, שביעות רצון גבוהה של האורחים ומחיר הנמוך מהמחיר הצפוי עבור נכסים בעלי מאפיינים דומים.</w:t>
+        <w:t xml:space="preserve"> מטרת שלב זה הייתה לזהות נכסים העונים להגדרת Hidden Gem שהצגנו בתחילת הפרויקט: נכסים המציעים איכות ותמורה גבוהה, אך זוכים לפופולריות נמוכה יחסית. הנחנו כי ניתן לזהות נכסים כאלה באמצעות שילוב של שלושה מאפיינים: פופולריות נמוכה, שביעות רצון גבוהה של האורחים ומחיר נמוך ביחס למחיר הצפוי עבור נכסים דומים.</w:t>
       </w:r>
     </w:p>
     <w:p>
@@ -1799,7 +1821,23 @@
           <w:i w:val="0"/>
           <w:rtl/>
         </w:rPr>
-        <w:t xml:space="preserve"> תהליך הזיהוי התבסס על שלושה קריטריונים משלימים. תחילה נותחו כל הביקורות באמצעות מודל הסנטימנט VADER, ומתוכן חושב לכל נכס שיעור הביקורות החיוביות. לאחר מכן סווגו נכסים כבעלי חשיפה נמוכה כאשר מספר הביקורות שקיבלו בשנת 2025 היה נמוך מהחציון בכלל המדגם. לבסוף, שילבנו מידע זה עם תוצאות מודל חיזוי המחיר (בעיה 1), כך שנכס הוגדר כ־Hidden Gem רק אם עמד בשלושת התנאים הבאים:</w:t>
+        <w:t xml:space="preserve"> תהליך הזיהוי התבסס על שלושה קריטריונים משלימים. ראשית, השתמשנו במספר הביקורות שקיבל כל נכס בשנת 2025 כמדד לפופולריות, וסיווגנו נכסים שמספר הביקורות שלהם היה נמוך מחציון המדגם כבעלי פופולריות נמוכה יחסית. שנית, ניתחנו את תוכן הביקורות באמצעות מודל הסנטימנט VADER, וחישבנו עבור כל נכס את שיעור הביקורות שסווגו כחיוביות. לבסוף, שילבנו את תוצאות מודל חיזוי המחיר מבעיה 1 כדי לזהות נכסים שמחירם בפועל נמוך מהמחיר הצפוי עבור נכסים בעלי מאפיינים דומים.</w:t>
+      </w:r>
+    </w:p>
+    <w:p>
+      <w:pPr>
+        <w:bidi/>
+        <w:spacing w:after="120"/>
+        <w:jc w:val="left"/>
+      </w:pPr>
+      <w:r>
+        <w:rPr>
+          <w:rFonts w:ascii="Segoe UI" w:hAnsi="Segoe UI" w:cs="Segoe UI"/>
+          <w:b w:val="0"/>
+          <w:i w:val="0"/>
+          <w:rtl/>
+        </w:rPr>
+        <w:t>נכס הוגדר כ־Hidden Gem אם עמד בשלושת התנאים הבאים:</w:t>
       </w:r>
     </w:p>
     <w:p>
@@ -1816,7 +1854,7 @@
           <w:i w:val="0"/>
           <w:rtl/>
         </w:rPr>
-        <w:t>מספר ביקורות נמוך מהחציון.</w:t>
+        <w:t>מספר הביקורות שקיבל בשנת 2025 היה נמוך מחציון המדגם.</w:t>
       </w:r>
     </w:p>
     <w:p>
@@ -1850,14 +1888,13 @@
           <w:i w:val="0"/>
           <w:rtl/>
         </w:rPr>
-        <w:t>מחירו בפועל נמוך בלפחות 15% מהמחיר שחזה מודל חיזוי המחיר.</w:t>
+        <w:t>מחירו בפועל היה נמוך בלפחות 15% מהמחיר שחזה עבורו מודל חיזוי המחיר.</w:t>
       </w:r>
     </w:p>
     <w:p>
       <w:pPr>
-        <w:pStyle w:val="ListNumber"/>
         <w:bidi/>
-        <w:spacing w:after="60"/>
+        <w:spacing w:after="120"/>
         <w:jc w:val="left"/>
       </w:pPr>
       <w:r>
@@ -1867,7 +1904,7 @@
           <w:i w:val="0"/>
           <w:rtl/>
         </w:rPr>
-        <w:t>הנכס נמצא בקבוצת הבדיקה (80%) של מודל חיזוי המחיר — כך שהתחזית ששימשה לבדיקת תנאי 3 היא הערכה אמיתית (out-of-sample) ולא כזו שהמודל "שינן" בזמן האימון.</w:t>
+        <w:t>בנוסף, הזיהוי הוגבל לנכסים שנכללו בקבוצת הבדיקה של מודל חיזוי המחיר. כך, תנאי המחיר התבסס בכל המקרים על תחזית עבור נכס שהמודל לא ראה בזמן האימון, ולא על תחזית שחושבה עבור נתוני האימון עצמם.</w:t>
       </w:r>
     </w:p>
     <w:p>
@@ -1901,7 +1938,23 @@
           <w:i w:val="0"/>
           <w:rtl/>
         </w:rPr>
-        <w:t xml:space="preserve"> מאחר שלא קיים תיוג אמת (Ground Truth) לנכסי Hidden Gem, לא ניתן היה להעריך את ביצועי האלגוריתם באמצעות מדדי דיוק מקובלים. לכן בחרנו בשתי שיטות הערכה. הראשונה הייתה בחינת כוח ההבחנה של כל אחד משלבי הסינון, כלומר כיצד כל קריטריון מצמצם את קבוצת המועמדים. השנייה הייתה הערכה איכותנית של הנכסים שנבחרו, באמצעות בחינת המחיר, דירוגי הביקורות ותוכן הביקורות עצמם, כפי שמוצג גם בניתוח ענני המילים בבעיה 4.</w:t>
+        <w:t xml:space="preserve"> לנכסי Hidden Gem אין תיוג אמת קיים (Ground Truth), ולכן לא ניתן היה להעריך את הזיהוי באמצעות מדדים מקובלים כגון precision, accuracy או recall. במקום זאת השתמשנו בשתי דרכי הערכה משלימות.</w:t>
+      </w:r>
+    </w:p>
+    <w:p>
+      <w:pPr>
+        <w:bidi/>
+        <w:spacing w:after="120"/>
+        <w:jc w:val="left"/>
+      </w:pPr>
+      <w:r>
+        <w:rPr>
+          <w:rFonts w:ascii="Segoe UI" w:hAnsi="Segoe UI" w:cs="Segoe UI"/>
+          <w:b w:val="0"/>
+          <w:i w:val="0"/>
+          <w:rtl/>
+        </w:rPr>
+        <w:t>ראשית, בחנו את תרומתו של כל קריטריון לתהליך הסינון ואת מספר הנכסים שנותרו לאחר כל שלב. כך יכולנו לבדוק שההגדרה אינה רחבה מדי ושכל אחד מהקריטריונים אכן מוסיף הבחנה בין הנכסים. שנית, ביצענו הערכה איכותנית של הנכסים שנבחרו באמצעות בחינת המחירים, דירוגי הביקורות ותוכן הביקורות שלהם — ניתוח שהורחב בבעיה 4 באמצעות בחינת השפה בביקורות (ענני מילים).</w:t>
       </w:r>
     </w:p>
     <w:p>
@@ -1935,7 +1988,7 @@
           <w:i w:val="0"/>
           <w:rtl/>
         </w:rPr>
-        <w:t xml:space="preserve"> שלושת קבצי המקור אוחדו (inner join) לפי </w:t>
+        <w:t xml:space="preserve"> לצורך הזיהוי אוחדו מקורות המידע לפי </w:t>
       </w:r>
       <w:r>
         <w:rPr>
@@ -1953,7 +2006,23 @@
           <w:i w:val="0"/>
           <w:rtl/>
         </w:rPr>
-        <w:t>, כך שאוכלוסיית ההערכה מוגבלת ל-22,943 הנכסים שמופיעים בשלושתם (נכסים עם מחיר, ביקורות, וגם תחזית מחיר).</w:t>
+        <w:t>, כך שלכל נכס היו זמינים נתוני הנכס, נתוני הביקורות ותחזית המחיר מהמודל של בעיה 1. לאחר האיחוד התקבלו 22,943 נכסים שניתן היה להעריך לפי שלושת הקריטריונים.</w:t>
+      </w:r>
+    </w:p>
+    <w:p>
+      <w:pPr>
+        <w:bidi/>
+        <w:spacing w:after="120"/>
+        <w:jc w:val="left"/>
+      </w:pPr>
+      <w:r>
+        <w:rPr>
+          <w:rFonts w:ascii="Segoe UI" w:hAnsi="Segoe UI" w:cs="Segoe UI"/>
+          <w:b w:val="0"/>
+          <w:i w:val="0"/>
+          <w:rtl/>
+        </w:rPr>
+        <w:t>מכיוון שתחזית המחיר משמשת כחלק מהגדרת ה־Hidden Gem, רק נכסים שנכללו בקבוצת הבדיקה של מודל חיזוי המחיר היו זכאים להיכלל בקבוצה הסופית.</w:t>
       </w:r>
     </w:p>
     <w:p>
@@ -1987,7 +2056,23 @@
           <w:i w:val="0"/>
           <w:rtl/>
         </w:rPr>
-        <w:t xml:space="preserve"> לאחר איחוד כלל מקורות המידע התקבלו 22,943 נכסים שניתן היה להעריך. מתוכם 10,898 נכסים (47.5%) סווגו כבעלי חשיפה נמוכה. לאחר הוספת תנאי הסנטימנט נותרו 2,766 נכסים (12.1%). 564 נכסים (2.5%) עמדו גם בתנאי המחיר, ולבסוף </w:t>
+        <w:t xml:space="preserve"> לאחר איחוד מקורות המידע התקבלו 22,943 נכסים שניתן היה להעריך. מתוכם, 10,898 נכסים (47.5%) עמדו בקריטריון הפופולריות הנמוכה. לאחר הוספת קריטריון הסנטימנט נותרו 2,766 נכסים (12.1%), ומתוכם 564 נכסים (2.5%) עמדו גם בקריטריון המחיר.</w:t>
+      </w:r>
+    </w:p>
+    <w:p>
+      <w:pPr>
+        <w:bidi/>
+        <w:spacing w:after="120"/>
+        <w:jc w:val="left"/>
+      </w:pPr>
+      <w:r>
+        <w:rPr>
+          <w:rFonts w:ascii="Segoe UI" w:hAnsi="Segoe UI" w:cs="Segoe UI"/>
+          <w:b w:val="0"/>
+          <w:i w:val="0"/>
+          <w:rtl/>
+        </w:rPr>
+        <w:t xml:space="preserve">לבסוף, לאחר הגבלת התוצאות לנכסים מקבוצת הבדיקה של מודל חיזוי המחיר, נותרו </w:t>
       </w:r>
       <w:r>
         <w:rPr>
@@ -2006,7 +2091,7 @@
           <w:i w:val="0"/>
           <w:rtl/>
         </w:rPr>
-        <w:t xml:space="preserve"> עמדו גם בתנאי הרביעי (קבוצת הבדיקה) והוגדרו כ־Hidden Gems.</w:t>
+        <w:t>, שהוגדרו כ־Hidden Gems.</w:t>
       </w:r>
     </w:p>
     <w:p>
@@ -2040,34 +2125,7 @@
           <w:i w:val="0"/>
           <w:rtl/>
         </w:rPr>
-        <w:t>docs/assets/hidden_gem_funnel.png</w:t>
-      </w:r>
-      <w:r>
-        <w:rPr>
-          <w:rFonts w:ascii="Segoe UI" w:hAnsi="Segoe UI" w:cs="Segoe UI"/>
-          <w:b w:val="0"/>
-          <w:i w:val="0"/>
-          <w:rtl/>
-        </w:rPr>
-        <w:t xml:space="preserve"> (משפך ארבעת שלבי הסינון), וכן הנקודות המודגשות בגרף הפיזור של בעיה 1 (כל הנכסים המודגשים נמצאים משמעותית מעל קו ה-</w:t>
-      </w:r>
-      <w:r>
-        <w:rPr>
-          <w:rFonts w:ascii="Segoe UI" w:hAnsi="Segoe UI" w:cs="Segoe UI"/>
-          <w:b w:val="0"/>
-          <w:i w:val="0"/>
-          <w:rtl/>
-        </w:rPr>
-        <w:t>y=x</w:t>
-      </w:r>
-      <w:r>
-        <w:rPr>
-          <w:rFonts w:ascii="Segoe UI" w:hAnsi="Segoe UI" w:cs="Segoe UI"/>
-          <w:b w:val="0"/>
-          <w:i w:val="0"/>
-          <w:rtl/>
-        </w:rPr>
-        <w:t>, כלומר המחיר החזוי גבוה בבירור מהמחיר בפועל).</w:t>
+        <w:t xml:space="preserve"> תהליך הסינון מוצג באמצעות תרשים משפך, הממחיש את מספר הנכסים שנותרו לאחר כל שלב ואת התרומה של כל קריטריון לצמצום קבוצת המועמדים.</w:t>
       </w:r>
     </w:p>
     <w:p>
@@ -2129,6 +2187,22 @@
     <w:p>
       <w:pPr>
         <w:bidi/>
+        <w:spacing w:after="120"/>
+        <w:jc w:val="left"/>
+      </w:pPr>
+      <w:r>
+        <w:rPr>
+          <w:rFonts w:ascii="Segoe UI" w:hAnsi="Segoe UI" w:cs="Segoe UI"/>
+          <w:b w:val="0"/>
+          <w:i w:val="0"/>
+          <w:rtl/>
+        </w:rPr>
+        <w:t>בנוסף, ה־Hidden Gems מודגשים בגרף המחיר בפועל מול המחיר החזוי שהוצג בבעיה 1. הנכסים שנבחרו נמצאים מעל קו x=y, כלומר המחיר שחזה עבורם המודל גבוה מהמחיר שבו הם מוצעים בפועל, בהתאם לקריטריון המחיר שהוגדר.</w:t>
+      </w:r>
+    </w:p>
+    <w:p>
+      <w:pPr>
+        <w:bidi/>
         <w:spacing w:after="20"/>
         <w:jc w:val="left"/>
       </w:pPr>
@@ -2157,7 +2231,7 @@
           <w:i w:val="0"/>
           <w:rtl/>
         </w:rPr>
-        <w:t xml:space="preserve"> האתגר המרכזי בשלב זה היה היעדר תיוג אמת של נכסי Hidden Gem. לכן לא ניתן היה לחשב מדדי הערכה מקובלים כגון Precision ו־Recall. הספים שנבחרו — מספר ביקורות הנמוך מהחציון, שיעור חיוביות של מעל 75% ומחיר הנמוך בלפחות 15% מהמחיר החזוי — מבוססים על היגיון מחקרי, אך לא כוילו באמצעות מדגם מתויג.</w:t>
+        <w:t xml:space="preserve"> האתגר המרכזי בשלב זה היה היעדר Ground Truth המגדיר אילו נכסים הם באמת Hidden Gems. כתוצאה מכך, לא ניתן היה להעריך את הזיהוי באמצעות מדדים מקובלים כגון Precision ו־Recall. הספים שנבחרו — מספר ביקורות הנמוך מהחציון, שיעור של למעלה מ־75% ביקורות חיוביות ומחיר הנמוך בלפחות 15% מהמחיר החזוי — נבחרו כך שישקפו את שלושת המרכיבים של הגדרת ה־Hidden Gem, אך לא ניתן היה לכייל אותם מול מדגם מתויג.</w:t>
       </w:r>
     </w:p>
     <w:p>
@@ -2173,7 +2247,7 @@
           <w:i w:val="0"/>
           <w:rtl/>
         </w:rPr>
-        <w:t>בנוסף, קריטריון המחיר תלוי באיכות התחזיות של המודל מהשלב הקודם, ולכן הוא מושפע גם ממגבלותיו. עם זאת, פער ההכללה של מודל המחיר קטן מאוד (0.007), ודרישת קבוצת הבדיקה (תנאי 4) מבטיחה שהתחזית תמיד out-of-sample. שני אלה מחזקים את מהימנות הסיווג, אך לא מבטלים את מגבלת דיוק החיזוי של מודל המחיר עצמו.</w:t>
+        <w:t>מגבלה נוספת היא שקריטריון המחיר תלוי באיכות מודל חיזוי המחיר מבעיה 1, ולכן טעויות בחיזוי עשויות להשפיע גם על זיהוי ה־Hidden Gems. כדי לצמצם מגבלה זו, הזיהוי הסופי הוגבל לנכסים מקבוצת הבדיקה בלבד, כך שכל פער מחיר התבסס על תחזית out-of-sample עבור נכס שלא שימש לאימון המודל. עם זאת, גם תחזיות אלה אינן מושלמות, ולכן יש להתייחס לקריטריון המחיר כאומדן ולא כמדד מוחלט.</w:t>
       </w:r>
     </w:p>
     <w:p>

</xml_diff>

<commit_message>
Clean up repo for submission: remove course materials, dead scripts and stale outputs
Removes files that are not part of the deliverable:
- course PDFs (lessons/, project_example/, homework_example/, project_guidelines/)
- exploration/debug scripts with no place in the pipeline
- clustering figures that never made it into the write-up (maps, scatters)
- run logs and committed __pycache__

Code changes:
- build_clusters.py: drop plot_clusters() and its palette, now that the
  scatter figures are gone
- README: pipeline block matches the scripts that actually exist
- .gitignore: __pycache__, *.pyc and Word ~$ lock files

docs/ is left as-is; its clean-up waits until the write-up is final.

Co-Authored-By: Claude Opus 5 (1M context) <noreply@anthropic.com>
</commit_message>
<xml_diff>
--- a/docs/writeup.docx
+++ b/docs/writeup.docx
@@ -125,7 +125,23 @@
           <w:i w:val="0"/>
           <w:rtl/>
         </w:rPr>
-        <w:t>פלטפורמות השכרה קצרת־טווח, כגון Airbnb, מציעות אלפי נכסים המתחרים על חשיפת המשתמשים, בעוד שבפועל רק חלק קטן מהם זוכה לבולטות גבוהה בתוצאות החיפוש. כתוצאה מכך, נכסים איכותיים עשויים להישאר פחות מוכרים. בפרויקט זה התמקדנו בשוק ה־Airbnb ברומא, איטליה, והגדרנו נכס כ־</w:t>
+        <w:t>פלטפורמות להשכרה קצרת־טווח, כגון Airbnb, מציעות מגוון רחב של נכסים הנבדלים זה מזה במחיר, במיקום, בדירוגים ובמאפיינים נוספים. עבור המשתמש, ההיצע הרחב מקשה לעיתים לזהות אילו נכסים באמת מציעים תמורה טובה, ולכן הבחירה יכולה להרגיש כמו "miss or hit".</w:t>
+      </w:r>
+    </w:p>
+    <w:p>
+      <w:pPr>
+        <w:bidi/>
+        <w:spacing w:after="120"/>
+        <w:jc w:val="left"/>
+      </w:pPr>
+      <w:r>
+        <w:rPr>
+          <w:rFonts w:ascii="Segoe UI" w:hAnsi="Segoe UI" w:cs="Segoe UI"/>
+          <w:b w:val="0"/>
+          <w:i w:val="0"/>
+          <w:rtl/>
+        </w:rPr>
+        <w:t xml:space="preserve">בפרויקט זה התמקדנו בשוק ה־Airbnb ברומא, איטליה, וביקשנו לזהות נכסים מסוג </w:t>
       </w:r>
       <w:r>
         <w:rPr>
@@ -135,7 +151,7 @@
           <w:color w:val="0B3D4D"/>
           <w:rtl/>
         </w:rPr>
-        <w:t>"Hidden Gem"</w:t>
+        <w:t>"Hidden Gems"</w:t>
       </w:r>
       <w:r>
         <w:rPr>
@@ -144,7 +160,40 @@
           <w:i w:val="0"/>
           <w:rtl/>
         </w:rPr>
-        <w:t xml:space="preserve"> כאשר הוא עומד בשלושה תנאים מרכזיים: הוא מתומחר באופן אטרקטיבי ביחס לנכסים דומים, זוכה לביקורות חיוביות, ובו בזמן אינו מוכר במיוחד. מטרתנו הייתה לבחון האם ניתן לזהות נכסים כאלה באופן אוטומטי באמצעות נתוני נכסים וביקורות ציבוריים, להבין אילו מאפיינים מייחדים אותם משאר השוק, ולבדוק האם הם מתחלקים לתת־קבוצות בעלות מאפיינים משותפים.</w:t>
+        <w:t>. לצורך הגדרת המושג הסתמכנו על הגדרת Wiktionary¹, המתארת Hidden Gem כדבר בעל ערך או איכות שאינו זוכה להכרה התואמת את ערכו. מתוך הגדרה זו גזרנו שלושה קריטריונים מדידים המתאימים לעולם ה־Airbnb: מחיר אטרקטיבי ביחס לנכסים דומים, ביקורות חיוביות ורמת פופולריות נמוכה יחסית. כלומר, חיפשנו נכסים המציעים תמורה ואיכות גבוהות, אך עדיין זוכים לפחות הכרה מנכסים דומים בשוק.</w:t>
+      </w:r>
+    </w:p>
+    <w:p>
+      <w:pPr>
+        <w:bidi/>
+        <w:spacing w:after="120"/>
+        <w:jc w:val="left"/>
+      </w:pPr>
+      <w:r>
+        <w:rPr>
+          <w:rFonts w:ascii="Segoe UI" w:hAnsi="Segoe UI" w:cs="Segoe UI"/>
+          <w:b w:val="0"/>
+          <w:i w:val="0"/>
+          <w:rtl/>
+        </w:rPr>
+        <w:t>מטרת הפרויקט הייתה לבחון האם ניתן לזהות נכסים כאלה באופן אוטומטי באמצעות נתוני נכסים וביקורות ציבוריות, להבין אילו מאפיינים מייחדים אותם משאר השוק, ולבדוק האם ניתן לזהות בתוכם תת־קבוצות בעלות מאפיינים משותפים.</w:t>
+      </w:r>
+    </w:p>
+    <w:p>
+      <w:pPr>
+        <w:bidi/>
+        <w:spacing w:after="120"/>
+        <w:jc w:val="left"/>
+      </w:pPr>
+      <w:r>
+        <w:rPr>
+          <w:rFonts w:ascii="Segoe UI" w:hAnsi="Segoe UI" w:cs="Segoe UI"/>
+          <w:b w:val="0"/>
+          <w:i/>
+          <w:color w:val="555555"/>
+          <w:rtl/>
+        </w:rPr>
+        <w:t>¹ Wiktionary. (2026). Hidden gem. In Wiktionary, the free dictionary. Retrieved July 29, 2026, from https://en.wiktionary.org/wiki/hidden_gem</w:t>
       </w:r>
     </w:p>
     <w:p>
@@ -611,7 +660,7 @@
           <w:i w:val="0"/>
           <w:rtl/>
         </w:rPr>
-        <w:t xml:space="preserve">בשל מספרן הרב של הביקורות ובמטרה להימנע מהטיות ושגיאות הנובעות מתרגום אוטומטי, בחרנו להתמקד בביקורות שנכתבו באנגלית בלבד. במהלך הפרויקט התברר כי שיטת סינון השפה הראשונית לא הייתה מדויקת מספיק, וכי חלק מהביקורות שסווגו כאנגליות נכתבו למעשה בשפות אחרות (כ-42% מהן, לפי בדיקה מדגמית). לכן, לצורך ניתוח הטקסט, ביצענו סינון מדויק יותר באמצעות הספרייה </w:t>
+        <w:t xml:space="preserve">מאחר שמאגר הביקורות כולל טקסטים בשפות רבות, ובמטרה להימנע מהטיות ושגיאות הנובעות מתרגום אוטומטי, בחרנו לבצע את הניתוח הטקסטואלי על ביקורות באנגלית בלבד (מזוהות באמצעות </w:t>
       </w:r>
       <w:r>
         <w:rPr>
@@ -629,7 +678,7 @@
           <w:i w:val="0"/>
           <w:rtl/>
         </w:rPr>
-        <w:t xml:space="preserve"> והשארנו רק ביקורות שזוהו כאנגלית.</w:t>
+        <w:t>), שהיוו כ-56% מהביקורות הרלוונטיות.</w:t>
       </w:r>
     </w:p>
     <w:p>
@@ -824,25 +873,7 @@
           <w:i w:val="0"/>
           <w:rtl/>
         </w:rPr>
-        <w:t xml:space="preserve"> לצורך חיזוי המחיר אימנו מודל עץ החלטה מסוג </w:t>
-      </w:r>
-      <w:r>
-        <w:rPr>
-          <w:rFonts w:ascii="Segoe UI" w:hAnsi="Segoe UI" w:cs="Segoe UI"/>
-          <w:b w:val="0"/>
-          <w:i w:val="0"/>
-          <w:rtl/>
-        </w:rPr>
-        <w:t>DecisionTreeRegressor</w:t>
-      </w:r>
-      <w:r>
-        <w:rPr>
-          <w:rFonts w:ascii="Segoe UI" w:hAnsi="Segoe UI" w:cs="Segoe UI"/>
-          <w:b w:val="0"/>
-          <w:i w:val="0"/>
-          <w:rtl/>
-        </w:rPr>
-        <w:t>. משתנה המטרה היה הלוגריתם של מחיר הנכס, שנבחר כדי לצמצם את השפעתם של מחירים חריגים ולמתן את ההתפלגות הימנית של המחירים. מורכבות העץ הוגבלה (</w:t>
+        <w:t xml:space="preserve"> לצורך חיזוי המחיר השתמשנו במודל עץ החלטה. מכיוון שהתפלגות המחירים הייתה מוטה וכללה גם מחירים חריגים, המודל נבנה לחיזוי הלוגריתם של מחיר הנכס ולא המחיר עצמו. כך צמצמנו את השפעתם של ערכים קיצוניים על החיזוי. כדי למנוע מהעץ להפוך למורכב מדי, הגבלנו את עומקו ואת מספר הדגימות המינימלי בכל עלה (</w:t>
       </w:r>
       <w:r>
         <w:rPr>
@@ -878,7 +909,7 @@
           <w:i w:val="0"/>
           <w:rtl/>
         </w:rPr>
-        <w:t>), כאשר הפרמטרים נבחרו באמצעות cross-validation על קבוצת האימון בלבד.</w:t>
+        <w:t>). ערכים אלה נבחרו באמצעות cross-validation על קבוצת האימון בלבד.</w:t>
       </w:r>
     </w:p>
     <w:p>
@@ -894,7 +925,7 @@
           <w:i w:val="0"/>
           <w:rtl/>
         </w:rPr>
-        <w:t>המודל התבסס על מאפיינים מבניים של הנכס, ובהם מספר האורחים שהוא מארח, מספר חדרי השינה והרחצה, מספר השירותים שהוא מציע, קווי הרוחב והאורך, מספר הלילות המינימלי והמקסימלי להזמנה, ותק המארח ומספר הנכסים שברשותו. בנוסף, כללנו את סוג החדר, סוג הנכס ואת אזור הנכס באמצעות קידוד קטגוריאלי — בסך הכול 53 משתנים.</w:t>
+        <w:t>המודל התבסס על מאפיינים מבניים ותפעוליים של הנכס, ובהם מספר האורחים שהנכס יכול לארח, מספר חדרי השינה והרחצה, מספר השירותים המוצעים, קווי הרוחב והאורך, מספר הלילות המינימלי והמקסימלי להזמנה, ותק המארח ומספר הנכסים שברשותו. בנוסף, כללנו את סוג החדר, סוג הנכס ואזור הנכס, שהומרו ממשתנים קטגוריאליים למשתנים מספריים. בסך הכול כלל המודל 53 משתנים.</w:t>
       </w:r>
     </w:p>
     <w:p>
@@ -910,7 +941,7 @@
           <w:i w:val="0"/>
           <w:rtl/>
         </w:rPr>
-        <w:t xml:space="preserve">במכוון לא נכללו מאפיינים המעידים על פופולריות: מספר הביקורות, קצב קבלת הביקורות, דירוגי הביקורות, הזמינות והתפוסה המוערכת. הסיבה היא שהפער בין המחיר בפועל למחיר החזוי משמש בהמשך כאחד הקריטריונים לזיהוי Hidden Gem, ולכן מודל שכבר מכיר את מידת הפופולריות של הנכס היה מזהם קריטריון זה. מאותה סיבה הוצא גם </w:t>
+        <w:t xml:space="preserve">במכוון לא נכללו במודל מאפיינים שעשויים לשקף את מידת הפופולריות או הביקוש לנכס, ובהם מספר הביקורות, קצב קבלת הביקורות, דירוגי הביקורות, הזמינות והתפוסה המוערכת. הסיבה לכך היא שהפער בין המחיר בפועל למחיר החזוי שימש בהמשך כקריטריון נפרד בזיהוי Hidden Gems, ולכן רצינו שמודל חיזוי המחיר יתבסס ככל האפשר על מאפייני הנכס עצמו ולא על מידת ההצלחה או הביקוש שלו בפועל. מאותה סיבה הוסר גם המשתנה </w:t>
       </w:r>
       <w:r>
         <w:rPr>
@@ -928,7 +959,7 @@
           <w:i w:val="0"/>
           <w:rtl/>
         </w:rPr>
-        <w:t>, המהווה למעשה מכפלה של המחיר במספר הלילות שהוזמנו.</w:t>
+        <w:t>, המחושב על בסיס מחיר הנכס ומספר הלילות שהוזמנו.</w:t>
       </w:r>
     </w:p>
     <w:p>
@@ -944,45 +975,7 @@
           <w:i w:val="0"/>
           <w:rtl/>
         </w:rPr>
-        <w:t xml:space="preserve">הנתונים חולקו לקבוצת אימון שכללה </w:t>
-      </w:r>
-      <w:r>
-        <w:rPr>
-          <w:rFonts w:ascii="Segoe UI" w:hAnsi="Segoe UI" w:cs="Segoe UI"/>
-          <w:b/>
-          <w:i w:val="0"/>
-          <w:color w:val="0B3D4D"/>
-          <w:rtl/>
-        </w:rPr>
-        <w:t>20%</w:t>
-      </w:r>
-      <w:r>
-        <w:rPr>
-          <w:rFonts w:ascii="Segoe UI" w:hAnsi="Segoe UI" w:cs="Segoe UI"/>
-          <w:b w:val="0"/>
-          <w:i w:val="0"/>
-          <w:rtl/>
-        </w:rPr>
-        <w:t xml:space="preserve"> מהנכסים ולקבוצת בדיקה שכללה </w:t>
-      </w:r>
-      <w:r>
-        <w:rPr>
-          <w:rFonts w:ascii="Segoe UI" w:hAnsi="Segoe UI" w:cs="Segoe UI"/>
-          <w:b/>
-          <w:i w:val="0"/>
-          <w:color w:val="0B3D4D"/>
-          <w:rtl/>
-        </w:rPr>
-        <w:t>80%</w:t>
-      </w:r>
-      <w:r>
-        <w:rPr>
-          <w:rFonts w:ascii="Segoe UI" w:hAnsi="Segoe UI" w:cs="Segoe UI"/>
-          <w:b w:val="0"/>
-          <w:i w:val="0"/>
-          <w:rtl/>
-        </w:rPr>
-        <w:t xml:space="preserve"> — יחס הפוך מהמקובל. הבחירה נובעת מכך שבבעיה 2 נכס יכול להיחשב Hidden Gem רק אם המחיר החזוי לו הוא הערכה אמיתית שלא נלמדה מהנכס עצמו (out-of-sample) — כלומר רק אם הוא נמצא בקבוצת הבדיקה. הגדלת קבוצת הבדיקה ל-80% מבטיחה שלמספר הרב ביותר האפשרי של נכסים תהיה תחזית מחיר תקפה לבדיקה זו. לאחר אימון המודל חישבנו עבור כל נכס את המחיר החזוי, ואת הפער בין המחיר בפועל למחיר החזוי. פער שלילי הצביע על נכס שמחירו נמוך מהמחיר שהמודל צפה עבורו.</w:t>
+        <w:t>לאחר אימון המודל חישבנו עבור כל נכס את המחיר החזוי ואת הפער בינו לבין המחיר בפועל. פער שלילי העיד כי מחירו בפועל של הנכס נמוך מהמחיר שהמודל צפה עבור נכס בעל מאפיינים דומים, ולכן שימש אינדיקציה לתמחור אטרקטיבי יחסית.</w:t>
       </w:r>
     </w:p>
     <w:p>
@@ -1016,23 +1009,7 @@
           <w:i w:val="0"/>
           <w:rtl/>
         </w:rPr>
-        <w:t xml:space="preserve"> את ביצועי המודל הערכנו על קבוצת הבדיקה בלבד, כדי לבחון את יכולתו לחזות מחירים של נכסים שלא נכללו באימון. השתמשנו במדדי RMSE ו־MAPE, המודדים בהתאמה את גודל טעות החיזוי ואת שיעור הסטייה היחסי בין המחיר בפועל למחיר החזוי.</w:t>
-      </w:r>
-    </w:p>
-    <w:p>
-      <w:pPr>
-        <w:bidi/>
-        <w:spacing w:after="120"/>
-        <w:jc w:val="left"/>
-      </w:pPr>
-      <w:r>
-        <w:rPr>
-          <w:rFonts w:ascii="Segoe UI" w:hAnsi="Segoe UI" w:cs="Segoe UI"/>
-          <w:b w:val="0"/>
-          <w:i w:val="0"/>
-          <w:rtl/>
-        </w:rPr>
-        <w:t>בנוסף, השווינו בין הביצועים על קבוצת הבדיקה לבין הביצועים על כלל הנתונים. השוואה זו נועדה לבדוק האם המודל התאים את עצמו יתר על המידה לנתוני האימון.</w:t>
+        <w:t xml:space="preserve"> את ביצועי המודל הערכנו באמצעות מדדי RMSE ו־MAPE, המודדים בהתאמה את גודל טעות החיזוי ואת שיעור הסטייה היחסי בין המחיר בפועל למחיר החזוי. הביצועים הסופיים נמדדו על קבוצת הבדיקה, כדי לבחון את יכולת המודל לחזות מחירים של נכסים שלא נכללו באימון. בנוסף, השווינו בין ביצועי המודל על קבוצת האימון לבין ביצועיו על קבוצת הבדיקה, כדי לבדוק האם קיימים סימנים ל־overfitting.</w:t>
       </w:r>
     </w:p>
     <w:p>
@@ -1066,7 +1043,23 @@
           <w:i w:val="0"/>
           <w:rtl/>
         </w:rPr>
-        <w:t xml:space="preserve"> לצורך הערכת ביצועי המודל השתמשנו בקבוצת הבדיקה, שכללה 80% מהנכסים (18,355) ולא שימשה בתהליך האימון. טעויות החיזוי חושבו הן בסולם הלוגריתמי שבו אומן המודל, והן לאחר המרת התחזיות חזרה למחירים ביורו, כדי לאפשר פרשנות מעשית של התוצאות.</w:t>
+        <w:t xml:space="preserve"> הנתונים חולקו באופן אקראי לשתי קבוצות: 20% מהנכסים שימשו כקבוצת האימון, ו־80% הנותרים, 18,355 נכסים, שימשו כקבוצת הבדיקה. קבוצת האימון שימשה לאימון המודל ולבחירת הפרמטרים באמצעות cross-validation, בעוד שקבוצת הבדיקה נשמרה להערכת הביצועים הסופית ולחיזוי מחירים עבור נכסים שלא נכללו בתהליך האימון.</w:t>
+      </w:r>
+    </w:p>
+    <w:p>
+      <w:pPr>
+        <w:bidi/>
+        <w:spacing w:after="120"/>
+        <w:jc w:val="left"/>
+      </w:pPr>
+      <w:r>
+        <w:rPr>
+          <w:rFonts w:ascii="Segoe UI" w:hAnsi="Segoe UI" w:cs="Segoe UI"/>
+          <w:b w:val="0"/>
+          <w:i w:val="0"/>
+          <w:rtl/>
+        </w:rPr>
+        <w:t>מכיוון שהמודל אומן על הלוגריתם של המחיר, טעויות החיזוי חושבו הן בסולם הלוגריתמי והן לאחר המרת התחזיות חזרה למחירים ביורו, כדי לאפשר פרשנות מעשית של התוצאות.</w:t>
       </w:r>
     </w:p>
     <w:p>
@@ -1477,26 +1470,7 @@
           <w:i w:val="0"/>
           <w:rtl/>
         </w:rPr>
-        <w:t xml:space="preserve">פער ההכללה (test↔כל הדאטה) ב-RMSE(log price) הוא </w:t>
-      </w:r>
-      <w:r>
-        <w:rPr>
-          <w:rFonts w:ascii="Segoe UI" w:hAnsi="Segoe UI" w:cs="Segoe UI"/>
-          <w:b/>
-          <w:i w:val="0"/>
-          <w:color w:val="0B3D4D"/>
-          <w:rtl/>
-        </w:rPr>
-        <w:t>+0.0068</w:t>
-      </w:r>
-      <w:r>
-        <w:rPr>
-          <w:rFonts w:ascii="Segoe UI" w:hAnsi="Segoe UI" w:cs="Segoe UI"/>
-          <w:b w:val="0"/>
-          <w:i w:val="0"/>
-          <w:rtl/>
-        </w:rPr>
-        <w:t xml:space="preserve"> — קטן מאוד, סימן לכך שהמודל כמעט לא "נהנה" משורות שראה באימון.</w:t>
+        <w:t>בפועל, טעות של כ-30% מהמחיר (MAPE) מספיקה כדי לספק בסיס אמין להשוואה בין המחיר בפועל למחיר הצפוי, וזהו הבסיס לזיהוי הנכסים המתומחרים בחסר בבעיה 2. ההבדל ב־RMSE בין קבוצת הבדיקה לבין כלל הנתונים היה קטן מאוד (0.0068), כלומר ביצועי המודל על נכסים שלא נכללו באימון היו דומים מאוד לביצועיו על כלל הנתונים.</w:t>
       </w:r>
     </w:p>
     <w:p>
@@ -1530,7 +1504,7 @@
           <w:i w:val="0"/>
           <w:rtl/>
         </w:rPr>
-        <w:t xml:space="preserve"> מחיר בפועל מול מחיר חזוי (סקאלת log-log) על ה-test set (n=18,355), כאשר כל 453 ה-Hidden Gems הסופיים מודגשים — מטבע ההגדרה (ראו בעיה 2), כולם נמצאים בקבוצת הבדיקה.</w:t>
+        <w:t xml:space="preserve"> מחיר בפועל מול מחיר חזוי (סקאלת log-log) על ה-test set (n=18,355), כאשר כל 453 ה-Hidden Gems הסופיים מודגשים.</w:t>
       </w:r>
     </w:p>
     <w:p>
@@ -1613,6 +1587,38 @@
         <w:spacing w:after="120"/>
         <w:jc w:val="left"/>
       </w:pPr>
+    </w:p>
+    <w:p>
+      <w:pPr>
+        <w:bidi/>
+        <w:spacing w:after="20"/>
+        <w:jc w:val="left"/>
+      </w:pPr>
+      <w:r>
+        <w:rPr>
+          <w:rFonts w:ascii="Segoe UI" w:hAnsi="Segoe UI" w:cs="Segoe UI"/>
+          <w:b/>
+          <w:i w:val="0"/>
+          <w:color w:val="0072B2"/>
+          <w:sz w:val="22"/>
+          <w:rtl/>
+        </w:rPr>
+        <w:t>השוואה בין עץ בסיס לעץ המוגבל</w:t>
+      </w:r>
+    </w:p>
+    <w:p>
+      <w:pPr>
+        <w:bidi/>
+        <w:spacing w:after="120"/>
+        <w:jc w:val="left"/>
+      </w:pPr>
+    </w:p>
+    <w:p>
+      <w:pPr>
+        <w:bidi/>
+        <w:spacing w:after="120"/>
+        <w:jc w:val="left"/>
+      </w:pPr>
       <w:r>
         <w:rPr>
           <w:rFonts w:ascii="Segoe UI" w:hAnsi="Segoe UI" w:cs="Segoe UI"/>
@@ -1620,7 +1626,23 @@
           <w:i w:val="0"/>
           <w:rtl/>
         </w:rPr>
-        <w:t xml:space="preserve"> עץ החלטה ללא הגבלת מורכבות על קבוצת האימון (4,588 נכסים) סובל מהתאמת יתר משמעותית: הוא מייצר 4,440 עלים — כלומר עלה נפרד כמעט לכל נכס — וטעות האימון שלו יורדת ל־0.004 בעוד שטעות הבדיקה נשארת 0.555. לכן מורכבות העץ מוגבלת, והפרמטרים (</w:t>
+        <w:t>כדי לבחון האם יש צורך להגביל את מורכבות עץ ההחלטה, השווינו תחילה בין עץ ללא הגבלת מורכבות לבין העץ המוגבל ששימש במודל הסופי. העץ הלא־מוגבל, שאומן על 4,588 נכסים, יצר 4,440 עלים - כמעט עלה נפרד לכל נכס. כתוצאה מכך, טעות האימון שלו הייתה נמוכה מאוד (0.004), אך טעות הבדיקה נותרה גבוהה (0.555), דבר המעיד על overfitting משמעותי.</w:t>
+      </w:r>
+    </w:p>
+    <w:p>
+      <w:pPr>
+        <w:bidi/>
+        <w:spacing w:after="120"/>
+        <w:jc w:val="left"/>
+      </w:pPr>
+      <w:r>
+        <w:rPr>
+          <w:rFonts w:ascii="Segoe UI" w:hAnsi="Segoe UI" w:cs="Segoe UI"/>
+          <w:b w:val="0"/>
+          <w:i w:val="0"/>
+          <w:rtl/>
+        </w:rPr>
+        <w:t xml:space="preserve">בעקבות זאת הגבלנו את מורכבות העץ, כאשר הערכים </w:t>
       </w:r>
       <w:r>
         <w:rPr>
@@ -1638,7 +1660,7 @@
           <w:i w:val="0"/>
           <w:rtl/>
         </w:rPr>
-        <w:t xml:space="preserve">, </w:t>
+        <w:t xml:space="preserve"> ו־</w:t>
       </w:r>
       <w:r>
         <w:rPr>
@@ -1656,7 +1678,7 @@
           <w:i w:val="0"/>
           <w:rtl/>
         </w:rPr>
-        <w:t>) נבחרים באמצעות 5-fold cross-validation על קבוצת האימון בלבד. העץ המוגבל מונה 91 עלים בלבד: הפער בין טעות האימון לטעות הבדיקה מצטמצם מ־0.551 ל־</w:t>
+        <w:t xml:space="preserve"> נבחרו באמצעות 5-fold cross-validation על קבוצת האימון בלבד. העץ המוגבל כלל 91 עלים בלבד. לאחר ההגבלה, הפער בין טעות האימון לטעות הבדיקה הצטמצם מ־0.551 ל־</w:t>
       </w:r>
       <w:r>
         <w:rPr>
@@ -1675,7 +1697,7 @@
           <w:i w:val="0"/>
           <w:rtl/>
         </w:rPr>
-        <w:t>, וטעות הבדיקה עצמה משתפרת מ־0.555 ל־</w:t>
+        <w:t>, ובמקביל טעות הבדיקה השתפרה מ־0.555 ל־</w:t>
       </w:r>
       <w:r>
         <w:rPr>
@@ -1710,7 +1732,7 @@
           <w:i w:val="0"/>
           <w:rtl/>
         </w:rPr>
-        <w:t>ממצא זה מדגיש את החשיבות של הערכת מודלים על נתונים שלא שימשו בתהליך האימון — הערכה על כלל הנתונים לא הייתה משקפת את איכות החיזוי האמיתית, משום שעץ לא-מוגבל לומד חלק גדול מנתוני האימון באופן כמעט מדויק. זו גם הסיבה לדרישה המפורשת בבעיה 2 שנכס Hidden Gem יהיה בקבוצת הבדיקה: כך הקריטריון של פער מחיר לעולם לא מתבסס על תחזית ש"שוחזרה" מזיכרון המודל, אלא על הערכה אמיתית.</w:t>
+        <w:t>השוואה זו הראתה כי הגבלת מורכבות העץ משפרת את יכולתו להכליל לנכסים שלא ראה במהלך האימון. מסיבה זו, זיהוי ה־Hidden Gems בוצע רק על נכסים מקבוצת הבדיקה, כך שפער המחיר שעליו מבוסס הקריטריון חושב תמיד עבור נכס שלא שימש לאימון המודל.</w:t>
       </w:r>
     </w:p>
     <w:p>
@@ -1765,7 +1787,7 @@
           <w:i w:val="0"/>
           <w:rtl/>
         </w:rPr>
-        <w:t xml:space="preserve"> מטרת שלב זה הייתה לזהות נכסים המהווים Hidden Gems – נכסים איכותיים שאינם זוכים לחשיפה רבה, אך מציעים תמורה גבוהה ביחס למחירם. הנחנו כי ניתן לזהות נכסים כאלה באמצעות שילוב של שלושה מאפיינים: פופולריות נמוכה יחסית, שביעות רצון גבוהה של האורחים ומחיר הנמוך מהמחיר הצפוי עבור נכסים בעלי מאפיינים דומים.</w:t>
+        <w:t xml:space="preserve"> מטרת שלב זה הייתה לזהות נכסים העונים להגדרת Hidden Gem שהצגנו בתחילת הפרויקט: נכסים המציעים איכות ותמורה גבוהה, אך זוכים לפופולריות נמוכה יחסית. הנחנו כי ניתן לזהות נכסים כאלה באמצעות שילוב של שלושה מאפיינים: פופולריות נמוכה, שביעות רצון גבוהה של האורחים ומחיר נמוך ביחס למחיר הצפוי עבור נכסים דומים.</w:t>
       </w:r>
     </w:p>
     <w:p>
@@ -1799,7 +1821,23 @@
           <w:i w:val="0"/>
           <w:rtl/>
         </w:rPr>
-        <w:t xml:space="preserve"> תהליך הזיהוי התבסס על שלושה קריטריונים משלימים. תחילה נותחו כל הביקורות באמצעות מודל הסנטימנט VADER, ומתוכן חושב לכל נכס שיעור הביקורות החיוביות. לאחר מכן סווגו נכסים כבעלי חשיפה נמוכה כאשר מספר הביקורות שקיבלו בשנת 2025 היה נמוך מהחציון בכלל המדגם. לבסוף, שילבנו מידע זה עם תוצאות מודל חיזוי המחיר (בעיה 1), כך שנכס הוגדר כ־Hidden Gem רק אם עמד בשלושת התנאים הבאים:</w:t>
+        <w:t xml:space="preserve"> תהליך הזיהוי התבסס על שלושה קריטריונים משלימים. ראשית, השתמשנו במספר הביקורות שקיבל כל נכס בשנת 2025 כמדד לפופולריות, וסיווגנו נכסים שמספר הביקורות שלהם היה נמוך מחציון המדגם כבעלי פופולריות נמוכה יחסית. שנית, ניתחנו את תוכן הביקורות באמצעות מודל הסנטימנט VADER, וחישבנו עבור כל נכס את שיעור הביקורות שסווגו כחיוביות. לבסוף, שילבנו את תוצאות מודל חיזוי המחיר מבעיה 1 כדי לזהות נכסים שמחירם בפועל נמוך מהמחיר הצפוי עבור נכסים בעלי מאפיינים דומים.</w:t>
+      </w:r>
+    </w:p>
+    <w:p>
+      <w:pPr>
+        <w:bidi/>
+        <w:spacing w:after="120"/>
+        <w:jc w:val="left"/>
+      </w:pPr>
+      <w:r>
+        <w:rPr>
+          <w:rFonts w:ascii="Segoe UI" w:hAnsi="Segoe UI" w:cs="Segoe UI"/>
+          <w:b w:val="0"/>
+          <w:i w:val="0"/>
+          <w:rtl/>
+        </w:rPr>
+        <w:t>נכס הוגדר כ־Hidden Gem אם עמד בשלושת התנאים הבאים:</w:t>
       </w:r>
     </w:p>
     <w:p>
@@ -1816,7 +1854,7 @@
           <w:i w:val="0"/>
           <w:rtl/>
         </w:rPr>
-        <w:t>מספר ביקורות נמוך מהחציון.</w:t>
+        <w:t>מספר הביקורות שקיבל בשנת 2025 היה נמוך מחציון המדגם.</w:t>
       </w:r>
     </w:p>
     <w:p>
@@ -1850,14 +1888,13 @@
           <w:i w:val="0"/>
           <w:rtl/>
         </w:rPr>
-        <w:t>מחירו בפועל נמוך בלפחות 15% מהמחיר שחזה מודל חיזוי המחיר.</w:t>
+        <w:t>מחירו בפועל היה נמוך בלפחות 15% מהמחיר שחזה עבורו מודל חיזוי המחיר.</w:t>
       </w:r>
     </w:p>
     <w:p>
       <w:pPr>
-        <w:pStyle w:val="ListNumber"/>
         <w:bidi/>
-        <w:spacing w:after="60"/>
+        <w:spacing w:after="120"/>
         <w:jc w:val="left"/>
       </w:pPr>
       <w:r>
@@ -1867,7 +1904,7 @@
           <w:i w:val="0"/>
           <w:rtl/>
         </w:rPr>
-        <w:t>הנכס נמצא בקבוצת הבדיקה (80%) של מודל חיזוי המחיר — כך שהתחזית ששימשה לבדיקת תנאי 3 היא הערכה אמיתית (out-of-sample) ולא כזו שהמודל "שינן" בזמן האימון.</w:t>
+        <w:t>בנוסף, הזיהוי הוגבל לנכסים שנכללו בקבוצת הבדיקה של מודל חיזוי המחיר. כך, תנאי המחיר התבסס בכל המקרים על תחזית עבור נכס שהמודל לא ראה בזמן האימון, ולא על תחזית שחושבה עבור נתוני האימון עצמם.</w:t>
       </w:r>
     </w:p>
     <w:p>
@@ -1901,7 +1938,23 @@
           <w:i w:val="0"/>
           <w:rtl/>
         </w:rPr>
-        <w:t xml:space="preserve"> מאחר שלא קיים תיוג אמת (Ground Truth) לנכסי Hidden Gem, לא ניתן היה להעריך את ביצועי האלגוריתם באמצעות מדדי דיוק מקובלים. לכן בחרנו בשתי שיטות הערכה. הראשונה הייתה בחינת כוח ההבחנה של כל אחד משלבי הסינון, כלומר כיצד כל קריטריון מצמצם את קבוצת המועמדים. השנייה הייתה הערכה איכותנית של הנכסים שנבחרו, באמצעות בחינת המחיר, דירוגי הביקורות ותוכן הביקורות עצמם, כפי שמוצג גם בניתוח ענני המילים בבעיה 4.</w:t>
+        <w:t xml:space="preserve"> לנכסי Hidden Gem אין תיוג אמת קיים (Ground Truth), ולכן לא ניתן היה להעריך את הזיהוי באמצעות מדדים מקובלים כגון precision, accuracy או recall. במקום זאת השתמשנו בשתי דרכי הערכה משלימות.</w:t>
+      </w:r>
+    </w:p>
+    <w:p>
+      <w:pPr>
+        <w:bidi/>
+        <w:spacing w:after="120"/>
+        <w:jc w:val="left"/>
+      </w:pPr>
+      <w:r>
+        <w:rPr>
+          <w:rFonts w:ascii="Segoe UI" w:hAnsi="Segoe UI" w:cs="Segoe UI"/>
+          <w:b w:val="0"/>
+          <w:i w:val="0"/>
+          <w:rtl/>
+        </w:rPr>
+        <w:t>ראשית, בחנו את תרומתו של כל קריטריון לתהליך הסינון ואת מספר הנכסים שנותרו לאחר כל שלב. כך יכולנו לבדוק שההגדרה אינה רחבה מדי ושכל אחד מהקריטריונים אכן מוסיף הבחנה בין הנכסים. שנית, ביצענו הערכה איכותנית של הנכסים שנבחרו באמצעות בחינת המחירים, דירוגי הביקורות ותוכן הביקורות שלהם — ניתוח שהורחב בבעיה 4 באמצעות בחינת השפה בביקורות (ענני מילים).</w:t>
       </w:r>
     </w:p>
     <w:p>
@@ -1935,7 +1988,7 @@
           <w:i w:val="0"/>
           <w:rtl/>
         </w:rPr>
-        <w:t xml:space="preserve"> שלושת קבצי המקור אוחדו (inner join) לפי </w:t>
+        <w:t xml:space="preserve"> לצורך הזיהוי אוחדו מקורות המידע לפי </w:t>
       </w:r>
       <w:r>
         <w:rPr>
@@ -1953,7 +2006,23 @@
           <w:i w:val="0"/>
           <w:rtl/>
         </w:rPr>
-        <w:t>, כך שאוכלוסיית ההערכה מוגבלת ל-22,943 הנכסים שמופיעים בשלושתם (נכסים עם מחיר, ביקורות, וגם תחזית מחיר).</w:t>
+        <w:t>, כך שלכל נכס היו זמינים נתוני הנכס, נתוני הביקורות ותחזית המחיר מהמודל של בעיה 1. לאחר האיחוד התקבלו 22,943 נכסים שניתן היה להעריך לפי שלושת הקריטריונים.</w:t>
+      </w:r>
+    </w:p>
+    <w:p>
+      <w:pPr>
+        <w:bidi/>
+        <w:spacing w:after="120"/>
+        <w:jc w:val="left"/>
+      </w:pPr>
+      <w:r>
+        <w:rPr>
+          <w:rFonts w:ascii="Segoe UI" w:hAnsi="Segoe UI" w:cs="Segoe UI"/>
+          <w:b w:val="0"/>
+          <w:i w:val="0"/>
+          <w:rtl/>
+        </w:rPr>
+        <w:t>מכיוון שתחזית המחיר משמשת כחלק מהגדרת ה־Hidden Gem, רק נכסים שנכללו בקבוצת הבדיקה של מודל חיזוי המחיר היו זכאים להיכלל בקבוצה הסופית.</w:t>
       </w:r>
     </w:p>
     <w:p>
@@ -1987,7 +2056,23 @@
           <w:i w:val="0"/>
           <w:rtl/>
         </w:rPr>
-        <w:t xml:space="preserve"> לאחר איחוד כלל מקורות המידע התקבלו 22,943 נכסים שניתן היה להעריך. מתוכם 10,898 נכסים (47.5%) סווגו כבעלי חשיפה נמוכה. לאחר הוספת תנאי הסנטימנט נותרו 2,766 נכסים (12.1%). 564 נכסים (2.5%) עמדו גם בתנאי המחיר, ולבסוף </w:t>
+        <w:t xml:space="preserve"> לאחר איחוד מקורות המידע התקבלו 22,943 נכסים שניתן היה להעריך. מתוכם, 10,898 נכסים (47.5%) עמדו בקריטריון הפופולריות הנמוכה. לאחר הוספת קריטריון הסנטימנט נותרו 2,766 נכסים (12.1%), ומתוכם 564 נכסים (2.5%) עמדו גם בקריטריון המחיר.</w:t>
+      </w:r>
+    </w:p>
+    <w:p>
+      <w:pPr>
+        <w:bidi/>
+        <w:spacing w:after="120"/>
+        <w:jc w:val="left"/>
+      </w:pPr>
+      <w:r>
+        <w:rPr>
+          <w:rFonts w:ascii="Segoe UI" w:hAnsi="Segoe UI" w:cs="Segoe UI"/>
+          <w:b w:val="0"/>
+          <w:i w:val="0"/>
+          <w:rtl/>
+        </w:rPr>
+        <w:t xml:space="preserve">לבסוף, לאחר הגבלת התוצאות לנכסים מקבוצת הבדיקה של מודל חיזוי המחיר, נותרו </w:t>
       </w:r>
       <w:r>
         <w:rPr>
@@ -2006,7 +2091,7 @@
           <w:i w:val="0"/>
           <w:rtl/>
         </w:rPr>
-        <w:t xml:space="preserve"> עמדו גם בתנאי הרביעי (קבוצת הבדיקה) והוגדרו כ־Hidden Gems.</w:t>
+        <w:t>, שהוגדרו כ־Hidden Gems.</w:t>
       </w:r>
     </w:p>
     <w:p>
@@ -2040,34 +2125,7 @@
           <w:i w:val="0"/>
           <w:rtl/>
         </w:rPr>
-        <w:t>docs/assets/hidden_gem_funnel.png</w:t>
-      </w:r>
-      <w:r>
-        <w:rPr>
-          <w:rFonts w:ascii="Segoe UI" w:hAnsi="Segoe UI" w:cs="Segoe UI"/>
-          <w:b w:val="0"/>
-          <w:i w:val="0"/>
-          <w:rtl/>
-        </w:rPr>
-        <w:t xml:space="preserve"> (משפך ארבעת שלבי הסינון), וכן הנקודות המודגשות בגרף הפיזור של בעיה 1 (כל הנכסים המודגשים נמצאים משמעותית מעל קו ה-</w:t>
-      </w:r>
-      <w:r>
-        <w:rPr>
-          <w:rFonts w:ascii="Segoe UI" w:hAnsi="Segoe UI" w:cs="Segoe UI"/>
-          <w:b w:val="0"/>
-          <w:i w:val="0"/>
-          <w:rtl/>
-        </w:rPr>
-        <w:t>y=x</w:t>
-      </w:r>
-      <w:r>
-        <w:rPr>
-          <w:rFonts w:ascii="Segoe UI" w:hAnsi="Segoe UI" w:cs="Segoe UI"/>
-          <w:b w:val="0"/>
-          <w:i w:val="0"/>
-          <w:rtl/>
-        </w:rPr>
-        <w:t>, כלומר המחיר החזוי גבוה בבירור מהמחיר בפועל).</w:t>
+        <w:t xml:space="preserve"> תהליך הסינון מוצג באמצעות תרשים משפך, הממחיש את מספר הנכסים שנותרו לאחר כל שלב ואת התרומה של כל קריטריון לצמצום קבוצת המועמדים.</w:t>
       </w:r>
     </w:p>
     <w:p>
@@ -2129,6 +2187,22 @@
     <w:p>
       <w:pPr>
         <w:bidi/>
+        <w:spacing w:after="120"/>
+        <w:jc w:val="left"/>
+      </w:pPr>
+      <w:r>
+        <w:rPr>
+          <w:rFonts w:ascii="Segoe UI" w:hAnsi="Segoe UI" w:cs="Segoe UI"/>
+          <w:b w:val="0"/>
+          <w:i w:val="0"/>
+          <w:rtl/>
+        </w:rPr>
+        <w:t>בנוסף, ה־Hidden Gems מודגשים בגרף המחיר בפועל מול המחיר החזוי שהוצג בבעיה 1. הנכסים שנבחרו נמצאים מעל קו x=y, כלומר המחיר שחזה עבורם המודל גבוה מהמחיר שבו הם מוצעים בפועל, בהתאם לקריטריון המחיר שהוגדר.</w:t>
+      </w:r>
+    </w:p>
+    <w:p>
+      <w:pPr>
+        <w:bidi/>
         <w:spacing w:after="20"/>
         <w:jc w:val="left"/>
       </w:pPr>
@@ -2157,7 +2231,7 @@
           <w:i w:val="0"/>
           <w:rtl/>
         </w:rPr>
-        <w:t xml:space="preserve"> האתגר המרכזי בשלב זה היה היעדר תיוג אמת של נכסי Hidden Gem. לכן לא ניתן היה לחשב מדדי הערכה מקובלים כגון Precision ו־Recall. הספים שנבחרו — מספר ביקורות הנמוך מהחציון, שיעור חיוביות של מעל 75% ומחיר הנמוך בלפחות 15% מהמחיר החזוי — מבוססים על היגיון מחקרי, אך לא כוילו באמצעות מדגם מתויג.</w:t>
+        <w:t xml:space="preserve"> האתגר המרכזי בשלב זה היה היעדר Ground Truth המגדיר אילו נכסים הם באמת Hidden Gems. כתוצאה מכך, לא ניתן היה להעריך את הזיהוי באמצעות מדדים מקובלים כגון Precision ו־Recall. הספים שנבחרו — מספר ביקורות הנמוך מהחציון, שיעור של למעלה מ־75% ביקורות חיוביות ומחיר הנמוך בלפחות 15% מהמחיר החזוי — נבחרו כך שישקפו את שלושת המרכיבים של הגדרת ה־Hidden Gem, אך לא ניתן היה לכייל אותם מול מדגם מתויג.</w:t>
       </w:r>
     </w:p>
     <w:p>
@@ -2173,7 +2247,7 @@
           <w:i w:val="0"/>
           <w:rtl/>
         </w:rPr>
-        <w:t>בנוסף, קריטריון המחיר תלוי באיכות התחזיות של המודל מהשלב הקודם, ולכן הוא מושפע גם ממגבלותיו. עם זאת, פער ההכללה של מודל המחיר קטן מאוד (0.007), ודרישת קבוצת הבדיקה (תנאי 4) מבטיחה שהתחזית תמיד out-of-sample. שני אלה מחזקים את מהימנות הסיווג, אך לא מבטלים את מגבלת דיוק החיזוי של מודל המחיר עצמו.</w:t>
+        <w:t>מגבלה נוספת היא שקריטריון המחיר תלוי באיכות מודל חיזוי המחיר מבעיה 1, ולכן טעויות בחיזוי עשויות להשפיע גם על זיהוי ה־Hidden Gems. כדי לצמצם מגבלה זו, הזיהוי הסופי הוגבל לנכסים מקבוצת הבדיקה בלבד, כך שכל פער מחיר התבסס על תחזית out-of-sample עבור נכס שלא שימש לאימון המודל. עם זאת, גם תחזיות אלה אינן מושלמות, ולכן יש להתייחס לקריטריון המחיר כאומדן ולא כמדד מוחלט.</w:t>
       </w:r>
     </w:p>
     <w:p>

</xml_diff>